<commit_message>
docs(structure): 📝 highlight citation placeholders in the Word export
The placeholders are written inside backticks in the Markdown, so the
exporter rendered them as code instead of applying the yellow highlight.

Co-Authored-By: Claude Fable 5.1 <noreply@anthropic.com>
</commit_message>
<xml_diff>
--- a/docs/thesis/exports/2026-10-15-chapter3-draft.docx
+++ b/docs/thesis/exports/2026-10-15-chapter3-draft.docx
@@ -32,12 +32,12 @@
       </w:r>
       <w:r>
         <w:rPr>
-          <w:rFonts w:ascii="Consolas" w:cs="Consolas" w:eastAsia="Consolas" w:hAnsi="Consolas"/>
           <w:i w:val="false"/>
           <w:iCs w:val="false"/>
           <w:color w:val="444444"/>
           <w:sz w:val="20"/>
           <w:szCs w:val="20"/>
+          <w:highlight w:val="yellow"/>
         </w:rPr>
         <w:t xml:space="preserve">[CITATION NEEDED: 技術名稱]</w:t>
       </w:r>
@@ -217,7 +217,7 @@
       </w:r>
       <w:r>
         <w:rPr>
-          <w:rFonts w:ascii="Consolas" w:cs="Consolas" w:eastAsia="Consolas" w:hAnsi="Consolas"/>
+          <w:highlight w:val="yellow"/>
         </w:rPr>
         <w:t xml:space="preserve">[CITATION NEEDED: Gemma]</w:t>
       </w:r>
@@ -226,12 +226,21 @@
       </w:r>
       <w:r>
         <w:rPr>
-          <w:rFonts w:ascii="Consolas" w:cs="Consolas" w:eastAsia="Consolas" w:hAnsi="Consolas"/>
+          <w:highlight w:val="yellow"/>
         </w:rPr>
         <w:t xml:space="preserve">[CITATION NEEDED: Gemini]</w:t>
       </w:r>
       <w:r>
         <w:t xml:space="preserve"> 保留為第二個後端，透過相同的介面呼叫，供第四章在公開資料集上做模型穩健性檢驗。兩個後端僅以「文字進、文字出」與「圖片加文字進、文字出」兩個函式銜接各階段，階段程式碼不依賴特定模型；模型選擇屬於工程決策，不是本研究的貢獻。插畫模型採 fal.ai 雲端服務執行的 FLUX.1-dev，理由見 3.5 節。</w:t>
+      </w:r>
+    </w:p>
+    <w:p>
+      <w:pPr>
+        <w:spacing w:after="120" w:line="360"/>
+        <w:jc w:val="both"/>
+      </w:pPr>
+      <w:r>
+        <w:t xml:space="preserve">系統原始碼公開於 GitHub（https://github.com/smallbeautygirl/Photo2Story）；各實驗所使用的程式版本（commit 編號）於第四章註明，以便對照。</w:t>
       </w:r>
     </w:p>
     <w:p>
@@ -253,7 +262,7 @@
       </w:r>
       <w:r>
         <w:rPr>
-          <w:rFonts w:ascii="Consolas" w:cs="Consolas" w:eastAsia="Consolas" w:hAnsi="Consolas"/>
+          <w:highlight w:val="yellow"/>
         </w:rPr>
         <w:t xml:space="preserve">[CITATION NEEDED: CLIP]</w:t>
       </w:r>
@@ -262,7 +271,7 @@
       </w:r>
       <w:r>
         <w:rPr>
-          <w:rFonts w:ascii="Consolas" w:cs="Consolas" w:eastAsia="Consolas" w:hAnsi="Consolas"/>
+          <w:highlight w:val="yellow"/>
         </w:rPr>
         <w:t xml:space="preserve">[CITATION NEEDED: Gemma]</w:t>
       </w:r>
@@ -1016,7 +1025,7 @@
       </w:r>
       <w:r>
         <w:rPr>
-          <w:rFonts w:ascii="Consolas" w:cs="Consolas" w:eastAsia="Consolas" w:hAnsi="Consolas"/>
+          <w:highlight w:val="yellow"/>
         </w:rPr>
         <w:t xml:space="preserve">[CITATION NEEDED: chain-of-thought prompting]</w:t>
       </w:r>
@@ -1052,7 +1061,7 @@
       </w:r>
       <w:r>
         <w:rPr>
-          <w:rFonts w:ascii="Consolas" w:cs="Consolas" w:eastAsia="Consolas" w:hAnsi="Consolas"/>
+          <w:highlight w:val="yellow"/>
         </w:rPr>
         <w:t xml:space="preserve">[CITATION NEEDED: FLUX]</w:t>
       </w:r>
@@ -1089,7 +1098,7 @@
       </w:r>
       <w:r>
         <w:rPr>
-          <w:rFonts w:ascii="Consolas" w:cs="Consolas" w:eastAsia="Consolas" w:hAnsi="Consolas"/>
+          <w:highlight w:val="yellow"/>
         </w:rPr>
         <w:t xml:space="preserve">[CITATION NEEDED: LoRA]</w:t>
       </w:r>
@@ -1130,12 +1139,12 @@
       </w:r>
       <w:r>
         <w:rPr>
-          <w:rFonts w:ascii="Consolas" w:cs="Consolas" w:eastAsia="Consolas" w:hAnsi="Consolas"/>
           <w:i w:val="false"/>
           <w:iCs w:val="false"/>
           <w:color w:val="444444"/>
           <w:sz w:val="20"/>
           <w:szCs w:val="20"/>
+          <w:highlight w:val="yellow"/>
         </w:rPr>
         <w:t xml:space="preserve">[CITATION NEEDED: FLUX.1 Kontext]</w:t>
       </w:r>
@@ -1169,7 +1178,7 @@
       </w:r>
       <w:r>
         <w:rPr>
-          <w:rFonts w:ascii="Consolas" w:cs="Consolas" w:eastAsia="Consolas" w:hAnsi="Consolas"/>
+          <w:highlight w:val="yellow"/>
         </w:rPr>
         <w:t xml:space="preserve">[CITATION NEEDED: spectral residual saliency]</w:t>
       </w:r>
@@ -1178,7 +1187,7 @@
       </w:r>
       <w:r>
         <w:rPr>
-          <w:rFonts w:ascii="Consolas" w:cs="Consolas" w:eastAsia="Consolas" w:hAnsi="Consolas"/>
+          <w:highlight w:val="yellow"/>
         </w:rPr>
         <w:t xml:space="preserve">[CITATION NEEDED: Canny]</w:t>
       </w:r>
@@ -1205,7 +1214,7 @@
       </w:r>
       <w:r>
         <w:rPr>
-          <w:rFonts w:ascii="Consolas" w:cs="Consolas" w:eastAsia="Consolas" w:hAnsi="Consolas"/>
+          <w:highlight w:val="yellow"/>
         </w:rPr>
         <w:t xml:space="preserve">[CITATION NEEDED: pypinyin]</w:t>
       </w:r>
@@ -1264,7 +1273,7 @@
       </w:r>
       <w:r>
         <w:rPr>
-          <w:rFonts w:ascii="Consolas" w:cs="Consolas" w:eastAsia="Consolas" w:hAnsi="Consolas"/>
+          <w:highlight w:val="yellow"/>
         </w:rPr>
         <w:t xml:space="preserve">[CITATION NEEDED: SAM 2; Grounding DINO]</w:t>
       </w:r>

</xml_diff>